<commit_message>
Add deep technical ground-truth section (masking/crop code, CNN and ViT forward pass, full repo data-flow) to defense guide (MD+DOCX) and animated HTML explainer
</commit_message>
<xml_diff>
--- a/docs/DEFENSE_A_TO_Z_LAYMAN_TECHNICAL_GUIDE.docx
+++ b/docs/DEFENSE_A_TO_Z_LAYMAN_TECHNICAL_GUIDE.docx
@@ -3711,6 +3711,2127 @@
         <w:rPr>
           <w:color w:val="184F95"/>
         </w:rPr>
+        <w:t>PART 2 — Deep Technical Ground Truth (code-level walkthrough)</w:t>
+      </w:r>
+    </w:p>
+    <w:p>
+      <w:r>
+        <w:t xml:space="preserve">This part goes one level deeper than §6–§13: it shows the </w:t>
+      </w:r>
+      <w:r>
+        <w:rPr>
+          <w:b/>
+        </w:rPr>
+        <w:t>actual code</w:t>
+      </w:r>
+      <w:r>
+        <w:t>, line by line in spirit,</w:t>
+      </w:r>
+    </w:p>
+    <w:p>
+      <w:r>
+        <w:t>for how a raw photo becomes a masked crop, how that crop passes through a CNN and through a</w:t>
+      </w:r>
+    </w:p>
+    <w:p>
+      <w:r>
+        <w:t>Transformer, and how the whole repository is wired together end to end. Everything quoted here is</w:t>
+      </w:r>
+    </w:p>
+    <w:p>
+      <w:r>
+        <w:t>copied from the real project files (paths given for each block), not paraphrased or invented.</w:t>
+      </w:r>
+    </w:p>
+    <w:p>
+      <w:pPr>
+        <w:pStyle w:val="Heading1"/>
+      </w:pPr>
+      <w:r>
+        <w:rPr>
+          <w:color w:val="184F95"/>
+        </w:rPr>
+        <w:t>2.1 From raw photo to a masked, cropped, resized tensor</w:t>
+      </w:r>
+    </w:p>
+    <w:p>
+      <w:r/>
+      <w:r>
+        <w:rPr>
+          <w:b/>
+        </w:rPr>
+        <w:t>Layman first:</w:t>
+      </w:r>
+      <w:r>
+        <w:t xml:space="preserve"> Four things happen to every fish before the network ever sees it: (1) we draw the</w:t>
+      </w:r>
+    </w:p>
+    <w:p>
+      <w:r>
+        <w:t>fish's exact outline as a black-and-white stencil, (2) we use that stencil to blacken out everything</w:t>
+      </w:r>
+    </w:p>
+    <w:p>
+      <w:r>
+        <w:t>that is *not* the fish, (3) we cut a square window centred on the fish, and (4) we resize that square</w:t>
+      </w:r>
+    </w:p>
+    <w:p>
+      <w:r>
+        <w:t>to a fixed 224×224 tensor the network expects.</w:t>
+      </w:r>
+    </w:p>
+    <w:p>
+      <w:r/>
+      <w:r>
+        <w:rPr>
+          <w:b/>
+        </w:rPr>
+        <w:t>Step 1 — build the mask from the stored polygon outline</w:t>
+      </w:r>
+      <w:r>
+        <w:t xml:space="preserve"> (`scripts/make_crops.py`):</w:t>
+      </w:r>
+    </w:p>
+    <w:p>
+      <w:pPr>
+        <w:spacing w:after="0"/>
+        <w:shd w:val="clear" w:color="auto" w:fill="F2F3F7"/>
+      </w:pPr>
+      <w:r>
+        <w:rPr>
+          <w:rFonts w:ascii="Consolas" w:hAnsi="Consolas"/>
+          <w:sz w:val="18"/>
+        </w:rPr>
+        <w:t>def mask_from_polygons(segmentation: str, size: tuple[int, int]) -&gt; Image.Image:</w:t>
+      </w:r>
+    </w:p>
+    <w:p>
+      <w:pPr>
+        <w:spacing w:after="0"/>
+        <w:shd w:val="clear" w:color="auto" w:fill="F2F3F7"/>
+      </w:pPr>
+      <w:r>
+        <w:rPr>
+          <w:rFonts w:ascii="Consolas" w:hAnsi="Consolas"/>
+          <w:sz w:val="18"/>
+        </w:rPr>
+        <w:t xml:space="preserve">    mask = Image.new("L", size, 0)                    # start fully black (0 = background)</w:t>
+      </w:r>
+    </w:p>
+    <w:p>
+      <w:pPr>
+        <w:spacing w:after="0"/>
+        <w:shd w:val="clear" w:color="auto" w:fill="F2F3F7"/>
+      </w:pPr>
+      <w:r>
+        <w:rPr>
+          <w:rFonts w:ascii="Consolas" w:hAnsi="Consolas"/>
+          <w:sz w:val="18"/>
+        </w:rPr>
+        <w:t xml:space="preserve">    draw = ImageDraw.Draw(mask)</w:t>
+      </w:r>
+    </w:p>
+    <w:p>
+      <w:pPr>
+        <w:spacing w:after="0"/>
+        <w:shd w:val="clear" w:color="auto" w:fill="F2F3F7"/>
+      </w:pPr>
+      <w:r>
+        <w:rPr>
+          <w:rFonts w:ascii="Consolas" w:hAnsi="Consolas"/>
+          <w:sz w:val="18"/>
+        </w:rPr>
+        <w:t xml:space="preserve">    for polygon in json.loads(segmentation):           # one or more polygons per fish</w:t>
+      </w:r>
+    </w:p>
+    <w:p>
+      <w:pPr>
+        <w:spacing w:after="0"/>
+        <w:shd w:val="clear" w:color="auto" w:fill="F2F3F7"/>
+      </w:pPr>
+      <w:r>
+        <w:rPr>
+          <w:rFonts w:ascii="Consolas" w:hAnsi="Consolas"/>
+          <w:sz w:val="18"/>
+        </w:rPr>
+        <w:t xml:space="preserve">        points = list(zip(polygon[0::2], polygon[1::2]))  # (x1,y1,x2,y2,...) -&gt; [(x1,y1),(x2,y2),...]</w:t>
+      </w:r>
+    </w:p>
+    <w:p>
+      <w:pPr>
+        <w:spacing w:after="0"/>
+        <w:shd w:val="clear" w:color="auto" w:fill="F2F3F7"/>
+      </w:pPr>
+      <w:r>
+        <w:rPr>
+          <w:rFonts w:ascii="Consolas" w:hAnsi="Consolas"/>
+          <w:sz w:val="18"/>
+        </w:rPr>
+        <w:t xml:space="preserve">        draw.polygon(points, fill=255)                 # 255 = white = "this pixel is the fish"</w:t>
+      </w:r>
+    </w:p>
+    <w:p>
+      <w:pPr>
+        <w:spacing w:after="0"/>
+        <w:shd w:val="clear" w:color="auto" w:fill="F2F3F7"/>
+      </w:pPr>
+      <w:r>
+        <w:rPr>
+          <w:rFonts w:ascii="Consolas" w:hAnsi="Consolas"/>
+          <w:sz w:val="18"/>
+        </w:rPr>
+        <w:t xml:space="preserve">    return mask</w:t>
+      </w:r>
+    </w:p>
+    <w:p>
+      <w:r>
+        <w:t>This produces a single-channel ("L" = luminance/greyscale) image the same size as the source photo,</w:t>
+      </w:r>
+    </w:p>
+    <w:p>
+      <w:r>
+        <w:t>where every pixel is either 0 (not-fish) or 255 (fish). This *is* the black mask: black background,</w:t>
+      </w:r>
+    </w:p>
+    <w:p>
+      <w:r>
+        <w:t>white fish silhouette.</w:t>
+      </w:r>
+    </w:p>
+    <w:p>
+      <w:r/>
+      <w:r>
+        <w:rPr>
+          <w:b/>
+        </w:rPr>
+        <w:t>Step 2 — apply the mask to blacken the background:</w:t>
+      </w:r>
+      <w:r/>
+    </w:p>
+    <w:p>
+      <w:pPr>
+        <w:spacing w:after="0"/>
+        <w:shd w:val="clear" w:color="auto" w:fill="F2F3F7"/>
+      </w:pPr>
+      <w:r>
+        <w:rPr>
+          <w:rFonts w:ascii="Consolas" w:hAnsi="Consolas"/>
+          <w:sz w:val="18"/>
+        </w:rPr>
+        <w:t>masked = Image.new("RGB", img.size, (0, 0, 0))   # a solid black canvas</w:t>
+      </w:r>
+    </w:p>
+    <w:p>
+      <w:pPr>
+        <w:spacing w:after="0"/>
+        <w:shd w:val="clear" w:color="auto" w:fill="F2F3F7"/>
+      </w:pPr>
+      <w:r>
+        <w:rPr>
+          <w:rFonts w:ascii="Consolas" w:hAnsi="Consolas"/>
+          <w:sz w:val="18"/>
+        </w:rPr>
+        <w:t>masked.paste(img, mask=mask)                      # paste the real photo, but ONLY where mask==255</w:t>
+      </w:r>
+    </w:p>
+    <w:p>
+      <w:r>
+        <w:t>`Image.paste(..., mask=...)` is doing the actual masking: wherever the mask is white, the original</w:t>
+      </w:r>
+    </w:p>
+    <w:p>
+      <w:r>
+        <w:t>pixel is copied through; wherever it is black, the black canvas underneath stays black. This is why</w:t>
+      </w:r>
+    </w:p>
+    <w:p>
+      <w:r>
+        <w:t>overlapping/occluding fish disappear from the crop — only the *target* fish's own polygon is white.</w:t>
+      </w:r>
+    </w:p>
+    <w:p>
+      <w:r/>
+      <w:r>
+        <w:rPr>
+          <w:b/>
+        </w:rPr>
+        <w:t>Step 3 — find a square bounding box around the mask and crop to it:</w:t>
+      </w:r>
+      <w:r/>
+    </w:p>
+    <w:p>
+      <w:pPr>
+        <w:spacing w:after="0"/>
+        <w:shd w:val="clear" w:color="auto" w:fill="F2F3F7"/>
+      </w:pPr>
+      <w:r>
+        <w:rPr>
+          <w:rFonts w:ascii="Consolas" w:hAnsi="Consolas"/>
+          <w:sz w:val="18"/>
+        </w:rPr>
+        <w:t>def square_bbox_from_mask(mask: np.ndarray) -&gt; tuple[int, int, int, int]:</w:t>
+      </w:r>
+    </w:p>
+    <w:p>
+      <w:pPr>
+        <w:spacing w:after="0"/>
+        <w:shd w:val="clear" w:color="auto" w:fill="F2F3F7"/>
+      </w:pPr>
+      <w:r>
+        <w:rPr>
+          <w:rFonts w:ascii="Consolas" w:hAnsi="Consolas"/>
+          <w:sz w:val="18"/>
+        </w:rPr>
+        <w:t xml:space="preserve">    ys, xs = np.where(mask &gt; 0)                    # coordinates of every "fish" pixel</w:t>
+      </w:r>
+    </w:p>
+    <w:p>
+      <w:pPr>
+        <w:spacing w:after="0"/>
+        <w:shd w:val="clear" w:color="auto" w:fill="F2F3F7"/>
+      </w:pPr>
+      <w:r>
+        <w:rPr>
+          <w:rFonts w:ascii="Consolas" w:hAnsi="Consolas"/>
+          <w:sz w:val="18"/>
+        </w:rPr>
+        <w:t xml:space="preserve">    x0, x1 = int(xs.min()), int(xs.max())</w:t>
+      </w:r>
+    </w:p>
+    <w:p>
+      <w:pPr>
+        <w:spacing w:after="0"/>
+        <w:shd w:val="clear" w:color="auto" w:fill="F2F3F7"/>
+      </w:pPr>
+      <w:r>
+        <w:rPr>
+          <w:rFonts w:ascii="Consolas" w:hAnsi="Consolas"/>
+          <w:sz w:val="18"/>
+        </w:rPr>
+        <w:t xml:space="preserve">    y0, y1 = int(ys.min()), int(ys.max())</w:t>
+      </w:r>
+    </w:p>
+    <w:p>
+      <w:pPr>
+        <w:spacing w:after="0"/>
+        <w:shd w:val="clear" w:color="auto" w:fill="F2F3F7"/>
+      </w:pPr>
+      <w:r>
+        <w:rPr>
+          <w:rFonts w:ascii="Consolas" w:hAnsi="Consolas"/>
+          <w:sz w:val="18"/>
+        </w:rPr>
+        <w:t xml:space="preserve">    side = max(x1 - x0 + 1, y1 - y0 + 1)            # make it SQUARE (avoids stretching later)</w:t>
+      </w:r>
+    </w:p>
+    <w:p>
+      <w:pPr>
+        <w:spacing w:after="0"/>
+        <w:shd w:val="clear" w:color="auto" w:fill="F2F3F7"/>
+      </w:pPr>
+      <w:r>
+        <w:rPr>
+          <w:rFonts w:ascii="Consolas" w:hAnsi="Consolas"/>
+          <w:sz w:val="18"/>
+        </w:rPr>
+        <w:t xml:space="preserve">    cx, cy = (x0 + x1) / 2.0, (y0 + y1) / 2.0        # centre of the fish</w:t>
+      </w:r>
+    </w:p>
+    <w:p>
+      <w:pPr>
+        <w:spacing w:after="0"/>
+        <w:shd w:val="clear" w:color="auto" w:fill="F2F3F7"/>
+      </w:pPr>
+      <w:r>
+        <w:rPr>
+          <w:rFonts w:ascii="Consolas" w:hAnsi="Consolas"/>
+          <w:sz w:val="18"/>
+        </w:rPr>
+        <w:t xml:space="preserve">    x0 = int(round(cx - side / 2.0))</w:t>
+      </w:r>
+    </w:p>
+    <w:p>
+      <w:pPr>
+        <w:spacing w:after="0"/>
+        <w:shd w:val="clear" w:color="auto" w:fill="F2F3F7"/>
+      </w:pPr>
+      <w:r>
+        <w:rPr>
+          <w:rFonts w:ascii="Consolas" w:hAnsi="Consolas"/>
+          <w:sz w:val="18"/>
+        </w:rPr>
+        <w:t xml:space="preserve">    y0 = int(round(cy - side / 2.0))</w:t>
+      </w:r>
+    </w:p>
+    <w:p>
+      <w:pPr>
+        <w:spacing w:after="0"/>
+        <w:shd w:val="clear" w:color="auto" w:fill="F2F3F7"/>
+      </w:pPr>
+      <w:r>
+        <w:rPr>
+          <w:rFonts w:ascii="Consolas" w:hAnsi="Consolas"/>
+          <w:sz w:val="18"/>
+        </w:rPr>
+        <w:t xml:space="preserve">    return x0, y0, side, side</w:t>
+      </w:r>
+    </w:p>
+    <w:p>
+      <w:r>
+        <w:t>Using the *longer* side for both width and height guarantees a square window — this matters because</w:t>
+      </w:r>
+    </w:p>
+    <w:p>
+      <w:r>
+        <w:t>a non-square crop, later force-resized to 224×224, would stretch the fish and corrupt the very length</w:t>
+      </w:r>
+    </w:p>
+    <w:p>
+      <w:r>
+        <w:t>signal we are trying to measure.</w:t>
+      </w:r>
+    </w:p>
+    <w:p>
+      <w:pPr>
+        <w:spacing w:after="0"/>
+        <w:shd w:val="clear" w:color="auto" w:fill="F2F3F7"/>
+      </w:pPr>
+      <w:r>
+        <w:rPr>
+          <w:rFonts w:ascii="Consolas" w:hAnsi="Consolas"/>
+          <w:sz w:val="18"/>
+        </w:rPr>
+        <w:t>def crop_with_padding(img: Image.Image, bbox: tuple[int, int, int, int]) -&gt; Image.Image:</w:t>
+      </w:r>
+    </w:p>
+    <w:p>
+      <w:pPr>
+        <w:spacing w:after="0"/>
+        <w:shd w:val="clear" w:color="auto" w:fill="F2F3F7"/>
+      </w:pPr>
+      <w:r>
+        <w:rPr>
+          <w:rFonts w:ascii="Consolas" w:hAnsi="Consolas"/>
+          <w:sz w:val="18"/>
+        </w:rPr>
+        <w:t xml:space="preserve">    x, y, w, h = bbox</w:t>
+      </w:r>
+    </w:p>
+    <w:p>
+      <w:pPr>
+        <w:spacing w:after="0"/>
+        <w:shd w:val="clear" w:color="auto" w:fill="F2F3F7"/>
+      </w:pPr>
+      <w:r>
+        <w:rPr>
+          <w:rFonts w:ascii="Consolas" w:hAnsi="Consolas"/>
+          <w:sz w:val="18"/>
+        </w:rPr>
+        <w:t xml:space="preserve">    canvas = Image.new("RGB", (w, h), (0, 0, 0))     # black canvas of the target crop size</w:t>
+      </w:r>
+    </w:p>
+    <w:p>
+      <w:pPr>
+        <w:spacing w:after="0"/>
+        <w:shd w:val="clear" w:color="auto" w:fill="F2F3F7"/>
+      </w:pPr>
+      <w:r>
+        <w:rPr>
+          <w:rFonts w:ascii="Consolas" w:hAnsi="Consolas"/>
+          <w:sz w:val="18"/>
+        </w:rPr>
+        <w:t xml:space="preserve">    src = (max(0, x), max(0, y), min(img.width, x + w), min(img.height, y + h))</w:t>
+      </w:r>
+    </w:p>
+    <w:p>
+      <w:pPr>
+        <w:spacing w:after="0"/>
+        <w:shd w:val="clear" w:color="auto" w:fill="F2F3F7"/>
+      </w:pPr>
+      <w:r>
+        <w:rPr>
+          <w:rFonts w:ascii="Consolas" w:hAnsi="Consolas"/>
+          <w:sz w:val="18"/>
+        </w:rPr>
+        <w:t xml:space="preserve">    dst = (src[0] - x, src[1] - y)</w:t>
+      </w:r>
+    </w:p>
+    <w:p>
+      <w:pPr>
+        <w:spacing w:after="0"/>
+        <w:shd w:val="clear" w:color="auto" w:fill="F2F3F7"/>
+      </w:pPr>
+      <w:r>
+        <w:rPr>
+          <w:rFonts w:ascii="Consolas" w:hAnsi="Consolas"/>
+          <w:sz w:val="18"/>
+        </w:rPr>
+        <w:t xml:space="preserve">    canvas.paste(img.crop(src), dst)                 # paste whatever part of the photo overlaps</w:t>
+      </w:r>
+    </w:p>
+    <w:p>
+      <w:pPr>
+        <w:spacing w:after="0"/>
+        <w:shd w:val="clear" w:color="auto" w:fill="F2F3F7"/>
+      </w:pPr>
+      <w:r>
+        <w:rPr>
+          <w:rFonts w:ascii="Consolas" w:hAnsi="Consolas"/>
+          <w:sz w:val="18"/>
+        </w:rPr>
+        <w:t xml:space="preserve">    return canvas</w:t>
+      </w:r>
+    </w:p>
+    <w:p>
+      <w:r>
+        <w:t>If the square window would run off the edge of the original photo, the missing area is simply left</w:t>
+      </w:r>
+    </w:p>
+    <w:p>
+      <w:r>
+        <w:t>black rather than crashing or wrapping — safe padding.</w:t>
+      </w:r>
+    </w:p>
+    <w:p>
+      <w:r/>
+      <w:r>
+        <w:rPr>
+          <w:b/>
+        </w:rPr>
+        <w:t>Step 4 — resize to the network's expected input size and save:</w:t>
+      </w:r>
+      <w:r/>
+    </w:p>
+    <w:p>
+      <w:pPr>
+        <w:spacing w:after="0"/>
+        <w:shd w:val="clear" w:color="auto" w:fill="F2F3F7"/>
+      </w:pPr>
+      <w:r>
+        <w:rPr>
+          <w:rFonts w:ascii="Consolas" w:hAnsi="Consolas"/>
+          <w:sz w:val="18"/>
+        </w:rPr>
+        <w:t>crop = crop_with_padding(masked, bbox)</w:t>
+      </w:r>
+    </w:p>
+    <w:p>
+      <w:pPr>
+        <w:spacing w:after="0"/>
+        <w:shd w:val="clear" w:color="auto" w:fill="F2F3F7"/>
+      </w:pPr>
+      <w:r>
+        <w:rPr>
+          <w:rFonts w:ascii="Consolas" w:hAnsi="Consolas"/>
+          <w:sz w:val="18"/>
+        </w:rPr>
+        <w:t>crop = crop.resize((args.size, args.size), Image.Resampling.BILINEAR)   # args.size = 224</w:t>
+      </w:r>
+    </w:p>
+    <w:p>
+      <w:pPr>
+        <w:spacing w:after="0"/>
+        <w:shd w:val="clear" w:color="auto" w:fill="F2F3F7"/>
+      </w:pPr>
+      <w:r>
+        <w:rPr>
+          <w:rFonts w:ascii="Consolas" w:hAnsi="Consolas"/>
+          <w:sz w:val="18"/>
+        </w:rPr>
+        <w:t>crop.save(out_path)   # data/processed/crops/{annotation_id:06d}.png</w:t>
+      </w:r>
+    </w:p>
+    <w:p>
+      <w:r>
+        <w:t>This whole four-step function runs once per annotation, for all 18,157 annotations, and the results</w:t>
+      </w:r>
+    </w:p>
+    <w:p>
+      <w:r>
+        <w:t>are cached to disk as PNG files — so training never has to redo this expensive masking/cropping</w:t>
+      </w:r>
+    </w:p>
+    <w:p>
+      <w:r>
+        <w:t>work; it just loads the finished PNG.</w:t>
+      </w:r>
+    </w:p>
+    <w:p>
+      <w:pPr>
+        <w:pStyle w:val="Heading1"/>
+      </w:pPr>
+      <w:r>
+        <w:rPr>
+          <w:color w:val="184F95"/>
+        </w:rPr>
+        <w:t>2.2 From a saved crop to a training example (dataset code)</w:t>
+      </w:r>
+    </w:p>
+    <w:p>
+      <w:r/>
+      <w:r>
+        <w:rPr>
+          <w:b/>
+        </w:rPr>
+        <w:t>File:</w:t>
+      </w:r>
+      <w:r>
+        <w:t xml:space="preserve"> `src/autofish_vfm/data.py`, class `CropDataset`. At training time, for every sample:</w:t>
+      </w:r>
+    </w:p>
+    <w:p>
+      <w:pPr>
+        <w:spacing w:after="0"/>
+        <w:shd w:val="clear" w:color="auto" w:fill="F2F3F7"/>
+      </w:pPr>
+      <w:r>
+        <w:rPr>
+          <w:rFonts w:ascii="Consolas" w:hAnsi="Consolas"/>
+          <w:sz w:val="18"/>
+        </w:rPr>
+        <w:t>image = Image.open(self.crops_dir / f"{int(row.annotation_id):06d}.png").convert("RGB")</w:t>
+      </w:r>
+    </w:p>
+    <w:p>
+      <w:pPr>
+        <w:spacing w:after="0"/>
+        <w:shd w:val="clear" w:color="auto" w:fill="F2F3F7"/>
+      </w:pPr>
+      <w:r>
+        <w:rPr>
+          <w:rFonts w:ascii="Consolas" w:hAnsi="Consolas"/>
+          <w:sz w:val="18"/>
+        </w:rPr>
+        <w:t>image = self.transform(image)          # Resize -&gt; ToTensor -&gt; [ColorJitter] -&gt; Normalize</w:t>
+      </w:r>
+    </w:p>
+    <w:p>
+      <w:pPr>
+        <w:spacing w:after="0"/>
+        <w:shd w:val="clear" w:color="auto" w:fill="F2F3F7"/>
+      </w:pPr>
+      <w:r>
+        <w:rPr>
+          <w:rFonts w:ascii="Consolas" w:hAnsi="Consolas"/>
+          <w:sz w:val="18"/>
+        </w:rPr>
+        <w:t>bbox = torch.tensor([</w:t>
+      </w:r>
+    </w:p>
+    <w:p>
+      <w:pPr>
+        <w:spacing w:after="0"/>
+        <w:shd w:val="clear" w:color="auto" w:fill="F2F3F7"/>
+      </w:pPr>
+      <w:r>
+        <w:rPr>
+          <w:rFonts w:ascii="Consolas" w:hAnsi="Consolas"/>
+          <w:sz w:val="18"/>
+        </w:rPr>
+        <w:t xml:space="preserve">    row.bbox_x / row.width,  row.bbox_y / row.height,</w:t>
+      </w:r>
+    </w:p>
+    <w:p>
+      <w:pPr>
+        <w:spacing w:after="0"/>
+        <w:shd w:val="clear" w:color="auto" w:fill="F2F3F7"/>
+      </w:pPr>
+      <w:r>
+        <w:rPr>
+          <w:rFonts w:ascii="Consolas" w:hAnsi="Consolas"/>
+          <w:sz w:val="18"/>
+        </w:rPr>
+        <w:t xml:space="preserve">    row.bbox_w / row.width,  row.bbox_h / row.height,</w:t>
+      </w:r>
+    </w:p>
+    <w:p>
+      <w:pPr>
+        <w:spacing w:after="0"/>
+        <w:shd w:val="clear" w:color="auto" w:fill="F2F3F7"/>
+      </w:pPr>
+      <w:r>
+        <w:rPr>
+          <w:rFonts w:ascii="Consolas" w:hAnsi="Consolas"/>
+          <w:sz w:val="18"/>
+        </w:rPr>
+        <w:t>], dtype=torch.float32)                 # the ORIGINAL photo's bbox, normalized to 0..1</w:t>
+      </w:r>
+    </w:p>
+    <w:p>
+      <w:pPr>
+        <w:spacing w:after="0"/>
+        <w:shd w:val="clear" w:color="auto" w:fill="F2F3F7"/>
+      </w:pPr>
+      <w:r>
+        <w:rPr>
+          <w:rFonts w:ascii="Consolas" w:hAnsi="Consolas"/>
+          <w:sz w:val="18"/>
+        </w:rPr>
+        <w:t>target = torch.tensor([row.length_cm], dtype=torch.float32)   # regression target</w:t>
+      </w:r>
+    </w:p>
+    <w:p>
+      <w:r>
+        <w:t>Two details worth defending in front of the professor: (1) the bbox fed to the model is computed from</w:t>
+      </w:r>
+    </w:p>
+    <w:p>
+      <w:r>
+        <w:t xml:space="preserve">the </w:t>
+      </w:r>
+      <w:r>
+        <w:rPr>
+          <w:b/>
+        </w:rPr>
+        <w:t>original, un-cropped photo's</w:t>
+      </w:r>
+      <w:r>
+        <w:t xml:space="preserve"> coordinates (not the crop), which is exactly why it restores the</w:t>
+      </w:r>
+    </w:p>
+    <w:p>
+      <w:r>
+        <w:t>scale information the crop/resize step throws away; (2) `ColorJitter` (random brightness/contrast/</w:t>
+      </w:r>
+    </w:p>
+    <w:p>
+      <w:r>
+        <w:t xml:space="preserve">saturation/hue) is applied </w:t>
+      </w:r>
+      <w:r>
+        <w:rPr>
+          <w:b/>
+        </w:rPr>
+        <w:t>only when `augment=True`</w:t>
+      </w:r>
+      <w:r>
+        <w:t>, which the training script sets for the</w:t>
+      </w:r>
+    </w:p>
+    <w:p>
+      <w:r>
+        <w:t>training split and never for validation/test — so evaluation is always on unperturbed images.</w:t>
+      </w:r>
+    </w:p>
+    <w:p>
+      <w:pPr>
+        <w:pStyle w:val="Heading1"/>
+      </w:pPr>
+      <w:r>
+        <w:rPr>
+          <w:color w:val="184F95"/>
+        </w:rPr>
+        <w:t>2.3 Inside a CNN encoder (MobileNetV2 example)</w:t>
+      </w:r>
+    </w:p>
+    <w:p>
+      <w:r/>
+      <w:r>
+        <w:rPr>
+          <w:b/>
+        </w:rPr>
+        <w:t>File:</w:t>
+      </w:r>
+      <w:r>
+        <w:t xml:space="preserve"> `src/autofish_vfm/models.py`, class `MobileNetV2Regressor`:</w:t>
+      </w:r>
+    </w:p>
+    <w:p>
+      <w:pPr>
+        <w:spacing w:after="0"/>
+        <w:shd w:val="clear" w:color="auto" w:fill="F2F3F7"/>
+      </w:pPr>
+      <w:r>
+        <w:rPr>
+          <w:rFonts w:ascii="Consolas" w:hAnsi="Consolas"/>
+          <w:sz w:val="18"/>
+        </w:rPr>
+        <w:t>class MobileNetV2Regressor(nn.Module):</w:t>
+      </w:r>
+    </w:p>
+    <w:p>
+      <w:pPr>
+        <w:spacing w:after="0"/>
+        <w:shd w:val="clear" w:color="auto" w:fill="F2F3F7"/>
+      </w:pPr>
+      <w:r>
+        <w:rPr>
+          <w:rFonts w:ascii="Consolas" w:hAnsi="Consolas"/>
+          <w:sz w:val="18"/>
+        </w:rPr>
+        <w:t xml:space="preserve">    def __init__(self, bbox_input=True, pretrained=True, freeze_encoder=False, head=None):</w:t>
+      </w:r>
+    </w:p>
+    <w:p>
+      <w:pPr>
+        <w:spacing w:after="0"/>
+        <w:shd w:val="clear" w:color="auto" w:fill="F2F3F7"/>
+      </w:pPr>
+      <w:r>
+        <w:rPr>
+          <w:rFonts w:ascii="Consolas" w:hAnsi="Consolas"/>
+          <w:sz w:val="18"/>
+        </w:rPr>
+        <w:t xml:space="preserve">        super().__init__()</w:t>
+      </w:r>
+    </w:p>
+    <w:p>
+      <w:pPr>
+        <w:spacing w:after="0"/>
+        <w:shd w:val="clear" w:color="auto" w:fill="F2F3F7"/>
+      </w:pPr>
+      <w:r>
+        <w:rPr>
+          <w:rFonts w:ascii="Consolas" w:hAnsi="Consolas"/>
+          <w:sz w:val="18"/>
+        </w:rPr>
+        <w:t xml:space="preserve">        weights = models.MobileNet_V2_Weights.IMAGENET1K_V1 if pretrained else None</w:t>
+      </w:r>
+    </w:p>
+    <w:p>
+      <w:pPr>
+        <w:spacing w:after="0"/>
+        <w:shd w:val="clear" w:color="auto" w:fill="F2F3F7"/>
+      </w:pPr>
+      <w:r>
+        <w:rPr>
+          <w:rFonts w:ascii="Consolas" w:hAnsi="Consolas"/>
+          <w:sz w:val="18"/>
+        </w:rPr>
+        <w:t xml:space="preserve">        self.features = models.mobilenet_v2(weights=weights)     # the pretrained CNN backbone</w:t>
+      </w:r>
+    </w:p>
+    <w:p>
+      <w:pPr>
+        <w:spacing w:after="0"/>
+        <w:shd w:val="clear" w:color="auto" w:fill="F2F3F7"/>
+      </w:pPr>
+      <w:r>
+        <w:rPr>
+          <w:rFonts w:ascii="Consolas" w:hAnsi="Consolas"/>
+          <w:sz w:val="18"/>
+        </w:rPr>
+        <w:t xml:space="preserve">        if freeze_encoder:</w:t>
+      </w:r>
+    </w:p>
+    <w:p>
+      <w:pPr>
+        <w:spacing w:after="0"/>
+        <w:shd w:val="clear" w:color="auto" w:fill="F2F3F7"/>
+      </w:pPr>
+      <w:r>
+        <w:rPr>
+          <w:rFonts w:ascii="Consolas" w:hAnsi="Consolas"/>
+          <w:sz w:val="18"/>
+        </w:rPr>
+        <w:t xml:space="preserve">            for param in self.features.parameters():</w:t>
+      </w:r>
+    </w:p>
+    <w:p>
+      <w:pPr>
+        <w:spacing w:after="0"/>
+        <w:shd w:val="clear" w:color="auto" w:fill="F2F3F7"/>
+      </w:pPr>
+      <w:r>
+        <w:rPr>
+          <w:rFonts w:ascii="Consolas" w:hAnsi="Consolas"/>
+          <w:sz w:val="18"/>
+        </w:rPr>
+        <w:t xml:space="preserve">                param.requires_grad = False                       # lock the backbone's weights</w:t>
+      </w:r>
+    </w:p>
+    <w:p>
+      <w:pPr>
+        <w:spacing w:after="0"/>
+        <w:shd w:val="clear" w:color="auto" w:fill="F2F3F7"/>
+      </w:pPr>
+      <w:r>
+        <w:rPr>
+          <w:rFonts w:ascii="Consolas" w:hAnsi="Consolas"/>
+          <w:sz w:val="18"/>
+        </w:rPr>
+        <w:t xml:space="preserve">        n_inputs = self.features.classifier[-1].in_features        # e.g. 1280 for MobileNetV2</w:t>
+      </w:r>
+    </w:p>
+    <w:p>
+      <w:pPr>
+        <w:spacing w:after="0"/>
+        <w:shd w:val="clear" w:color="auto" w:fill="F2F3F7"/>
+      </w:pPr>
+      <w:r>
+        <w:rPr>
+          <w:rFonts w:ascii="Consolas" w:hAnsi="Consolas"/>
+          <w:sz w:val="18"/>
+        </w:rPr>
+        <w:t xml:space="preserve">        self.features.classifier = self.features.classifier[:-1]   # remove ImageNet's 1000-class head</w:t>
+      </w:r>
+    </w:p>
+    <w:p>
+      <w:pPr>
+        <w:spacing w:after="0"/>
+        <w:shd w:val="clear" w:color="auto" w:fill="F2F3F7"/>
+      </w:pPr>
+      <w:r>
+        <w:rPr>
+          <w:rFonts w:ascii="Consolas" w:hAnsi="Consolas"/>
+          <w:sz w:val="18"/>
+        </w:rPr>
+        <w:t xml:space="preserve">        if bbox_input:</w:t>
+      </w:r>
+    </w:p>
+    <w:p>
+      <w:pPr>
+        <w:spacing w:after="0"/>
+        <w:shd w:val="clear" w:color="auto" w:fill="F2F3F7"/>
+      </w:pPr>
+      <w:r>
+        <w:rPr>
+          <w:rFonts w:ascii="Consolas" w:hAnsi="Consolas"/>
+          <w:sz w:val="18"/>
+        </w:rPr>
+        <w:t xml:space="preserve">            n_inputs += 4                                          # room for the 4 bbox numbers</w:t>
+      </w:r>
+    </w:p>
+    <w:p>
+      <w:pPr>
+        <w:spacing w:after="0"/>
+        <w:shd w:val="clear" w:color="auto" w:fill="F2F3F7"/>
+      </w:pPr>
+      <w:r>
+        <w:rPr>
+          <w:rFonts w:ascii="Consolas" w:hAnsi="Consolas"/>
+          <w:sz w:val="18"/>
+        </w:rPr>
+        <w:t xml:space="preserve">        self.classifier = make_regression_head(n_inputs, head or [1000, 500, 1])</w:t>
+      </w:r>
+    </w:p>
+    <w:p>
+      <w:pPr>
+        <w:spacing w:after="0"/>
+        <w:shd w:val="clear" w:color="auto" w:fill="F2F3F7"/>
+      </w:pPr>
+      <w:r>
+        <w:rPr>
+          <w:rFonts w:ascii="Consolas" w:hAnsi="Consolas"/>
+          <w:sz w:val="18"/>
+        </w:rPr>
+        <w:t xml:space="preserve"> </w:t>
+      </w:r>
+    </w:p>
+    <w:p>
+      <w:pPr>
+        <w:spacing w:after="0"/>
+        <w:shd w:val="clear" w:color="auto" w:fill="F2F3F7"/>
+      </w:pPr>
+      <w:r>
+        <w:rPr>
+          <w:rFonts w:ascii="Consolas" w:hAnsi="Consolas"/>
+          <w:sz w:val="18"/>
+        </w:rPr>
+        <w:t xml:space="preserve">    def forward(self, batch):</w:t>
+      </w:r>
+    </w:p>
+    <w:p>
+      <w:pPr>
+        <w:spacing w:after="0"/>
+        <w:shd w:val="clear" w:color="auto" w:fill="F2F3F7"/>
+      </w:pPr>
+      <w:r>
+        <w:rPr>
+          <w:rFonts w:ascii="Consolas" w:hAnsi="Consolas"/>
+          <w:sz w:val="18"/>
+        </w:rPr>
+        <w:t xml:space="preserve">        image, bbox = batch</w:t>
+      </w:r>
+    </w:p>
+    <w:p>
+      <w:pPr>
+        <w:spacing w:after="0"/>
+        <w:shd w:val="clear" w:color="auto" w:fill="F2F3F7"/>
+      </w:pPr>
+      <w:r>
+        <w:rPr>
+          <w:rFonts w:ascii="Consolas" w:hAnsi="Consolas"/>
+          <w:sz w:val="18"/>
+        </w:rPr>
+        <w:t xml:space="preserve">        features = self.features(image)          # CNN: conv layers -&gt; global pooled feature vector</w:t>
+      </w:r>
+    </w:p>
+    <w:p>
+      <w:pPr>
+        <w:spacing w:after="0"/>
+        <w:shd w:val="clear" w:color="auto" w:fill="F2F3F7"/>
+      </w:pPr>
+      <w:r>
+        <w:rPr>
+          <w:rFonts w:ascii="Consolas" w:hAnsi="Consolas"/>
+          <w:sz w:val="18"/>
+        </w:rPr>
+        <w:t xml:space="preserve">        if self.bbox_input:</w:t>
+      </w:r>
+    </w:p>
+    <w:p>
+      <w:pPr>
+        <w:spacing w:after="0"/>
+        <w:shd w:val="clear" w:color="auto" w:fill="F2F3F7"/>
+      </w:pPr>
+      <w:r>
+        <w:rPr>
+          <w:rFonts w:ascii="Consolas" w:hAnsi="Consolas"/>
+          <w:sz w:val="18"/>
+        </w:rPr>
+        <w:t xml:space="preserve">            features = torch.cat([features, bbox], dim=1)   # concatenate along the feature dimension</w:t>
+      </w:r>
+    </w:p>
+    <w:p>
+      <w:pPr>
+        <w:spacing w:after="0"/>
+        <w:shd w:val="clear" w:color="auto" w:fill="F2F3F7"/>
+      </w:pPr>
+      <w:r>
+        <w:rPr>
+          <w:rFonts w:ascii="Consolas" w:hAnsi="Consolas"/>
+          <w:sz w:val="18"/>
+        </w:rPr>
+        <w:t xml:space="preserve">        return self.classifier(features)          # small MLP -&gt; one number (length in cm)</w:t>
+      </w:r>
+    </w:p>
+    <w:p>
+      <w:r/>
+      <w:r>
+        <w:rPr>
+          <w:b/>
+        </w:rPr>
+        <w:t>What a CNN does mechanically, layer by layer:</w:t>
+      </w:r>
+      <w:r>
+        <w:t xml:space="preserve"> MobileNetV2's `features` stack is a sequence of</w:t>
+      </w:r>
+    </w:p>
+    <w:p>
+      <w:r/>
+      <w:r>
+        <w:rPr>
+          <w:b/>
+        </w:rPr>
+        <w:t>inverted residual blocks</w:t>
+      </w:r>
+      <w:r>
+        <w:t xml:space="preserve"> — each one expands the channel count with a 1×1 convolution, applies a</w:t>
+      </w:r>
+    </w:p>
+    <w:p>
+      <w:r/>
+      <w:r>
+        <w:rPr>
+          <w:b/>
+        </w:rPr>
+        <w:t>depthwise</w:t>
+      </w:r>
+      <w:r>
+        <w:t xml:space="preserve"> 3×3 convolution (one filter per channel, cheap), then projects back down with another</w:t>
+      </w:r>
+    </w:p>
+    <w:p>
+      <w:r>
+        <w:t>1×1 convolution. Stacking many of these blocks progressively shrinks the spatial resolution (via</w:t>
+      </w:r>
+    </w:p>
+    <w:p>
+      <w:r>
+        <w:t>stride-2 blocks) while growing the channel/feature depth, ending in a single pooled vector — this is</w:t>
+      </w:r>
+    </w:p>
+    <w:p>
+      <w:r>
+        <w:t>the encoder's output, a compact numerical summary of the whole image. The `pretrained=True` weights</w:t>
+      </w:r>
+    </w:p>
+    <w:p>
+      <w:r>
+        <w:t>mean this stack starts from ImageNet-trained values rather than random noise, which is why training</w:t>
+      </w:r>
+    </w:p>
+    <w:p>
+      <w:r>
+        <w:t>converges quickly even with only ~11,000 training crops.</w:t>
+      </w:r>
+    </w:p>
+    <w:p>
+      <w:pPr>
+        <w:pStyle w:val="Heading1"/>
+      </w:pPr>
+      <w:r>
+        <w:rPr>
+          <w:color w:val="184F95"/>
+        </w:rPr>
+        <w:t>2.4 Inside a Vision Transformer encoder (DINOv2 example) and the CLS-vs-patch code</w:t>
+      </w:r>
+    </w:p>
+    <w:p>
+      <w:r/>
+      <w:r>
+        <w:rPr>
+          <w:b/>
+        </w:rPr>
+        <w:t>File:</w:t>
+      </w:r>
+      <w:r>
+        <w:t xml:space="preserve"> `src/autofish_vfm/models.py`, class `DINOv2Regressor._features`:</w:t>
+      </w:r>
+    </w:p>
+    <w:p>
+      <w:pPr>
+        <w:spacing w:after="0"/>
+        <w:shd w:val="clear" w:color="auto" w:fill="F2F3F7"/>
+      </w:pPr>
+      <w:r>
+        <w:rPr>
+          <w:rFonts w:ascii="Consolas" w:hAnsi="Consolas"/>
+          <w:sz w:val="18"/>
+        </w:rPr>
+        <w:t>def _features(self, image):</w:t>
+      </w:r>
+    </w:p>
+    <w:p>
+      <w:pPr>
+        <w:spacing w:after="0"/>
+        <w:shd w:val="clear" w:color="auto" w:fill="F2F3F7"/>
+      </w:pPr>
+      <w:r>
+        <w:rPr>
+          <w:rFonts w:ascii="Consolas" w:hAnsi="Consolas"/>
+          <w:sz w:val="18"/>
+        </w:rPr>
+        <w:t xml:space="preserve">    if hasattr(self.encoder, "forward_features"):</w:t>
+      </w:r>
+    </w:p>
+    <w:p>
+      <w:pPr>
+        <w:spacing w:after="0"/>
+        <w:shd w:val="clear" w:color="auto" w:fill="F2F3F7"/>
+      </w:pPr>
+      <w:r>
+        <w:rPr>
+          <w:rFonts w:ascii="Consolas" w:hAnsi="Consolas"/>
+          <w:sz w:val="18"/>
+        </w:rPr>
+        <w:t xml:space="preserve">        features = self.encoder.forward_features(image)   # returns a dict of token outputs</w:t>
+      </w:r>
+    </w:p>
+    <w:p>
+      <w:pPr>
+        <w:spacing w:after="0"/>
+        <w:shd w:val="clear" w:color="auto" w:fill="F2F3F7"/>
+      </w:pPr>
+      <w:r>
+        <w:rPr>
+          <w:rFonts w:ascii="Consolas" w:hAnsi="Consolas"/>
+          <w:sz w:val="18"/>
+        </w:rPr>
+        <w:t xml:space="preserve">        if isinstance(features, dict):</w:t>
+      </w:r>
+    </w:p>
+    <w:p>
+      <w:pPr>
+        <w:spacing w:after="0"/>
+        <w:shd w:val="clear" w:color="auto" w:fill="F2F3F7"/>
+      </w:pPr>
+      <w:r>
+        <w:rPr>
+          <w:rFonts w:ascii="Consolas" w:hAnsi="Consolas"/>
+          <w:sz w:val="18"/>
+        </w:rPr>
+        <w:t xml:space="preserve">            if self.use_patch_tokens and "x_norm_patchtokens" in features:</w:t>
+      </w:r>
+    </w:p>
+    <w:p>
+      <w:pPr>
+        <w:spacing w:after="0"/>
+        <w:shd w:val="clear" w:color="auto" w:fill="F2F3F7"/>
+      </w:pPr>
+      <w:r>
+        <w:rPr>
+          <w:rFonts w:ascii="Consolas" w:hAnsi="Consolas"/>
+          <w:sz w:val="18"/>
+        </w:rPr>
+        <w:t xml:space="preserve">                return features["x_norm_patchtokens"].mean(dim=1)   # average all patch vectors</w:t>
+      </w:r>
+    </w:p>
+    <w:p>
+      <w:pPr>
+        <w:spacing w:after="0"/>
+        <w:shd w:val="clear" w:color="auto" w:fill="F2F3F7"/>
+      </w:pPr>
+      <w:r>
+        <w:rPr>
+          <w:rFonts w:ascii="Consolas" w:hAnsi="Consolas"/>
+          <w:sz w:val="18"/>
+        </w:rPr>
+        <w:t xml:space="preserve">            if "x_norm_clstoken" in features:</w:t>
+      </w:r>
+    </w:p>
+    <w:p>
+      <w:pPr>
+        <w:spacing w:after="0"/>
+        <w:shd w:val="clear" w:color="auto" w:fill="F2F3F7"/>
+      </w:pPr>
+      <w:r>
+        <w:rPr>
+          <w:rFonts w:ascii="Consolas" w:hAnsi="Consolas"/>
+          <w:sz w:val="18"/>
+        </w:rPr>
+        <w:t xml:space="preserve">                return features["x_norm_clstoken"]                  # the single [CLS] vector</w:t>
+      </w:r>
+    </w:p>
+    <w:p>
+      <w:pPr>
+        <w:spacing w:after="0"/>
+        <w:shd w:val="clear" w:color="auto" w:fill="F2F3F7"/>
+      </w:pPr>
+      <w:r>
+        <w:rPr>
+          <w:rFonts w:ascii="Consolas" w:hAnsi="Consolas"/>
+          <w:sz w:val="18"/>
+        </w:rPr>
+        <w:t xml:space="preserve">            if "x_norm_patchtokens" in features:</w:t>
+      </w:r>
+    </w:p>
+    <w:p>
+      <w:pPr>
+        <w:spacing w:after="0"/>
+        <w:shd w:val="clear" w:color="auto" w:fill="F2F3F7"/>
+      </w:pPr>
+      <w:r>
+        <w:rPr>
+          <w:rFonts w:ascii="Consolas" w:hAnsi="Consolas"/>
+          <w:sz w:val="18"/>
+        </w:rPr>
+        <w:t xml:space="preserve">                return features["x_norm_patchtokens"].mean(dim=1)</w:t>
+      </w:r>
+    </w:p>
+    <w:p>
+      <w:pPr>
+        <w:spacing w:after="0"/>
+        <w:shd w:val="clear" w:color="auto" w:fill="F2F3F7"/>
+      </w:pPr>
+      <w:r>
+        <w:rPr>
+          <w:rFonts w:ascii="Consolas" w:hAnsi="Consolas"/>
+          <w:sz w:val="18"/>
+        </w:rPr>
+        <w:t xml:space="preserve">    features = self.encoder(image)</w:t>
+      </w:r>
+    </w:p>
+    <w:p>
+      <w:pPr>
+        <w:spacing w:after="0"/>
+        <w:shd w:val="clear" w:color="auto" w:fill="F2F3F7"/>
+      </w:pPr>
+      <w:r>
+        <w:rPr>
+          <w:rFonts w:ascii="Consolas" w:hAnsi="Consolas"/>
+          <w:sz w:val="18"/>
+        </w:rPr>
+        <w:t xml:space="preserve">    if features.ndim == 3:</w:t>
+      </w:r>
+    </w:p>
+    <w:p>
+      <w:pPr>
+        <w:spacing w:after="0"/>
+        <w:shd w:val="clear" w:color="auto" w:fill="F2F3F7"/>
+      </w:pPr>
+      <w:r>
+        <w:rPr>
+          <w:rFonts w:ascii="Consolas" w:hAnsi="Consolas"/>
+          <w:sz w:val="18"/>
+        </w:rPr>
+        <w:t xml:space="preserve">        return features[:, 0]</w:t>
+      </w:r>
+    </w:p>
+    <w:p>
+      <w:pPr>
+        <w:spacing w:after="0"/>
+        <w:shd w:val="clear" w:color="auto" w:fill="F2F3F7"/>
+      </w:pPr>
+      <w:r>
+        <w:rPr>
+          <w:rFonts w:ascii="Consolas" w:hAnsi="Consolas"/>
+          <w:sz w:val="18"/>
+        </w:rPr>
+        <w:t xml:space="preserve">    return features</w:t>
+      </w:r>
+    </w:p>
+    <w:p>
+      <w:r/>
+      <w:r>
+        <w:rPr>
+          <w:b/>
+        </w:rPr>
+        <w:t>What a ViT does mechanically:</w:t>
+      </w:r>
+      <w:r>
+        <w:t xml:space="preserve"> the 224×224 image is sliced into a grid of small 14×14-pixel</w:t>
+      </w:r>
+    </w:p>
+    <w:p>
+      <w:r>
+        <w:t>patches (for `dinov2_vits14`); each patch is flattened and linearly projected into a token vector; a</w:t>
+      </w:r>
+    </w:p>
+    <w:p>
+      <w:r>
+        <w:t xml:space="preserve">learned </w:t>
+      </w:r>
+      <w:r>
+        <w:rPr>
+          <w:b/>
+        </w:rPr>
+        <w:t>[CLS] token</w:t>
+      </w:r>
+      <w:r>
+        <w:t xml:space="preserve"> is prepended to the sequence; the whole sequence passes through repeated</w:t>
+      </w:r>
+    </w:p>
+    <w:p>
+      <w:r/>
+      <w:r>
+        <w:rPr>
+          <w:b/>
+        </w:rPr>
+        <w:t>self-attention</w:t>
+      </w:r>
+      <w:r>
+        <w:t xml:space="preserve"> blocks where *every* token can directly weight and mix information from *every</w:t>
+      </w:r>
+    </w:p>
+    <w:p>
+      <w:r>
+        <w:t>other* token (unlike a CNN, which only sees nearby pixels until many layers deep). After the final</w:t>
+      </w:r>
+    </w:p>
+    <w:p>
+      <w:r>
+        <w:t>block, `x_norm_clstoken` is the CLS token's vector — one global summary — and `x_norm_patchtokens` is</w:t>
+      </w:r>
+    </w:p>
+    <w:p>
+      <w:r>
+        <w:t>the full grid of per-patch vectors, still carrying spatial layout. `.mean(dim=1)` in the patch-token</w:t>
+      </w:r>
+    </w:p>
+    <w:p>
+      <w:r>
+        <w:t>branch is literally averaging that grid down to one vector, but — unlike the CLS token — that</w:t>
+      </w:r>
+    </w:p>
+    <w:p>
+      <w:r>
+        <w:t>average is built from vectors that each still encode *where in the image* they came from, which is</w:t>
+      </w:r>
+    </w:p>
+    <w:p>
+      <w:r>
+        <w:t>why it preserves more of the size/shape signal that length regression needs. This is the exact code</w:t>
+      </w:r>
+    </w:p>
+    <w:p>
+      <w:r>
+        <w:t>change that produced the 1.843 → 1.261 cm improvement documented in §17.</w:t>
+      </w:r>
+    </w:p>
+    <w:p>
+      <w:pPr>
+        <w:pStyle w:val="Heading1"/>
+      </w:pPr>
+      <w:r>
+        <w:rPr>
+          <w:color w:val="184F95"/>
+        </w:rPr>
+        <w:t>2.5 The training loop, in real code</w:t>
+      </w:r>
+    </w:p>
+    <w:p>
+      <w:r/>
+      <w:r>
+        <w:rPr>
+          <w:b/>
+        </w:rPr>
+        <w:t>File:</w:t>
+      </w:r>
+      <w:r>
+        <w:t xml:space="preserve"> `src/autofish_vfm/train_baseline.py` (the core loop, lightly trimmed for space):</w:t>
+      </w:r>
+    </w:p>
+    <w:p>
+      <w:pPr>
+        <w:spacing w:after="0"/>
+        <w:shd w:val="clear" w:color="auto" w:fill="F2F3F7"/>
+      </w:pPr>
+      <w:r>
+        <w:rPr>
+          <w:rFonts w:ascii="Consolas" w:hAnsi="Consolas"/>
+          <w:sz w:val="18"/>
+        </w:rPr>
+        <w:t>for epoch in range(1, config["epochs"] + 1):</w:t>
+      </w:r>
+    </w:p>
+    <w:p>
+      <w:pPr>
+        <w:spacing w:after="0"/>
+        <w:shd w:val="clear" w:color="auto" w:fill="F2F3F7"/>
+      </w:pPr>
+      <w:r>
+        <w:rPr>
+          <w:rFonts w:ascii="Consolas" w:hAnsi="Consolas"/>
+          <w:sz w:val="18"/>
+        </w:rPr>
+        <w:t xml:space="preserve">    model.train()</w:t>
+      </w:r>
+    </w:p>
+    <w:p>
+      <w:pPr>
+        <w:spacing w:after="0"/>
+        <w:shd w:val="clear" w:color="auto" w:fill="F2F3F7"/>
+      </w:pPr>
+      <w:r>
+        <w:rPr>
+          <w:rFonts w:ascii="Consolas" w:hAnsi="Consolas"/>
+          <w:sz w:val="18"/>
+        </w:rPr>
+        <w:t xml:space="preserve">    for batch in train_loader:</w:t>
+      </w:r>
+    </w:p>
+    <w:p>
+      <w:pPr>
+        <w:spacing w:after="0"/>
+        <w:shd w:val="clear" w:color="auto" w:fill="F2F3F7"/>
+      </w:pPr>
+      <w:r>
+        <w:rPr>
+          <w:rFonts w:ascii="Consolas" w:hAnsi="Consolas"/>
+          <w:sz w:val="18"/>
+        </w:rPr>
+        <w:t xml:space="preserve">        x, target, _ = move_batch(batch, device)</w:t>
+      </w:r>
+    </w:p>
+    <w:p>
+      <w:pPr>
+        <w:spacing w:after="0"/>
+        <w:shd w:val="clear" w:color="auto" w:fill="F2F3F7"/>
+      </w:pPr>
+      <w:r>
+        <w:rPr>
+          <w:rFonts w:ascii="Consolas" w:hAnsi="Consolas"/>
+          <w:sz w:val="18"/>
+        </w:rPr>
+        <w:t xml:space="preserve">        optimizer.zero_grad(set_to_none=True)</w:t>
+      </w:r>
+    </w:p>
+    <w:p>
+      <w:pPr>
+        <w:spacing w:after="0"/>
+        <w:shd w:val="clear" w:color="auto" w:fill="F2F3F7"/>
+      </w:pPr>
+      <w:r>
+        <w:rPr>
+          <w:rFonts w:ascii="Consolas" w:hAnsi="Consolas"/>
+          <w:sz w:val="18"/>
+        </w:rPr>
+        <w:t xml:space="preserve">        pred = model(x)                       # forward pass: crop+bbox -&gt; predicted length</w:t>
+      </w:r>
+    </w:p>
+    <w:p>
+      <w:pPr>
+        <w:spacing w:after="0"/>
+        <w:shd w:val="clear" w:color="auto" w:fill="F2F3F7"/>
+      </w:pPr>
+      <w:r>
+        <w:rPr>
+          <w:rFonts w:ascii="Consolas" w:hAnsi="Consolas"/>
+          <w:sz w:val="18"/>
+        </w:rPr>
+        <w:t xml:space="preserve">        loss = criterion(pred, target)        # L1 loss: mean(|pred - target|)</w:t>
+      </w:r>
+    </w:p>
+    <w:p>
+      <w:pPr>
+        <w:spacing w:after="0"/>
+        <w:shd w:val="clear" w:color="auto" w:fill="F2F3F7"/>
+      </w:pPr>
+      <w:r>
+        <w:rPr>
+          <w:rFonts w:ascii="Consolas" w:hAnsi="Consolas"/>
+          <w:sz w:val="18"/>
+        </w:rPr>
+        <w:t xml:space="preserve">        loss.backward()                       # backpropagation: compute gradients</w:t>
+      </w:r>
+    </w:p>
+    <w:p>
+      <w:pPr>
+        <w:spacing w:after="0"/>
+        <w:shd w:val="clear" w:color="auto" w:fill="F2F3F7"/>
+      </w:pPr>
+      <w:r>
+        <w:rPr>
+          <w:rFonts w:ascii="Consolas" w:hAnsi="Consolas"/>
+          <w:sz w:val="18"/>
+        </w:rPr>
+        <w:t xml:space="preserve">        optimizer.step()                      # Adam: update every trainable weight</w:t>
+      </w:r>
+    </w:p>
+    <w:p>
+      <w:pPr>
+        <w:spacing w:after="0"/>
+        <w:shd w:val="clear" w:color="auto" w:fill="F2F3F7"/>
+      </w:pPr>
+      <w:r>
+        <w:rPr>
+          <w:rFonts w:ascii="Consolas" w:hAnsi="Consolas"/>
+          <w:sz w:val="18"/>
+        </w:rPr>
+        <w:t xml:space="preserve">    y_true, y_pred, _ = predict(model, val_loader, device)</w:t>
+      </w:r>
+    </w:p>
+    <w:p>
+      <w:pPr>
+        <w:spacing w:after="0"/>
+        <w:shd w:val="clear" w:color="auto" w:fill="F2F3F7"/>
+      </w:pPr>
+      <w:r>
+        <w:rPr>
+          <w:rFonts w:ascii="Consolas" w:hAnsi="Consolas"/>
+          <w:sz w:val="18"/>
+        </w:rPr>
+        <w:t xml:space="preserve">    val_metrics = regression_metrics(y_true, y_pred)</w:t>
+      </w:r>
+    </w:p>
+    <w:p>
+      <w:pPr>
+        <w:spacing w:after="0"/>
+        <w:shd w:val="clear" w:color="auto" w:fill="F2F3F7"/>
+      </w:pPr>
+      <w:r>
+        <w:rPr>
+          <w:rFonts w:ascii="Consolas" w:hAnsi="Consolas"/>
+          <w:sz w:val="18"/>
+        </w:rPr>
+        <w:t xml:space="preserve">    torch.save(model.state_dict(), out_dir / "last.pt")</w:t>
+      </w:r>
+    </w:p>
+    <w:p>
+      <w:pPr>
+        <w:spacing w:after="0"/>
+        <w:shd w:val="clear" w:color="auto" w:fill="F2F3F7"/>
+      </w:pPr>
+      <w:r>
+        <w:rPr>
+          <w:rFonts w:ascii="Consolas" w:hAnsi="Consolas"/>
+          <w:sz w:val="18"/>
+        </w:rPr>
+        <w:t xml:space="preserve">    if val_metrics["mae_cm"] &lt; best_val:</w:t>
+      </w:r>
+    </w:p>
+    <w:p>
+      <w:pPr>
+        <w:spacing w:after="0"/>
+        <w:shd w:val="clear" w:color="auto" w:fill="F2F3F7"/>
+      </w:pPr>
+      <w:r>
+        <w:rPr>
+          <w:rFonts w:ascii="Consolas" w:hAnsi="Consolas"/>
+          <w:sz w:val="18"/>
+        </w:rPr>
+        <w:t xml:space="preserve">        best_val = val_metrics["mae_cm"]</w:t>
+      </w:r>
+    </w:p>
+    <w:p>
+      <w:pPr>
+        <w:spacing w:after="0"/>
+        <w:shd w:val="clear" w:color="auto" w:fill="F2F3F7"/>
+      </w:pPr>
+      <w:r>
+        <w:rPr>
+          <w:rFonts w:ascii="Consolas" w:hAnsi="Consolas"/>
+          <w:sz w:val="18"/>
+        </w:rPr>
+        <w:t xml:space="preserve">        torch.save(model.state_dict(), out_dir / "best.pt")   # keep only if validation improved</w:t>
+      </w:r>
+    </w:p>
+    <w:p>
+      <w:r>
+        <w:t>This is literally the entire "how training works" story from §12, now shown as the real PyTorch code</w:t>
+      </w:r>
+    </w:p>
+    <w:p>
+      <w:r>
+        <w:t>that produced every number in this document: one epoch = one full loop over `train_loader`; each</w:t>
+      </w:r>
+    </w:p>
+    <w:p>
+      <w:r>
+        <w:t>batch does forward → loss → backward → optimizer step; after every epoch the model is scored on</w:t>
+      </w:r>
+    </w:p>
+    <w:p>
+      <w:r>
+        <w:t>`val_loader` and `best.pt` is overwritten only when validation MAE improves — this is the mechanism</w:t>
+      </w:r>
+    </w:p>
+    <w:p>
+      <w:r>
+        <w:t>that guarantees the test set (evaluated separately, once, by `evaluate.py`) never influences which</w:t>
+      </w:r>
+    </w:p>
+    <w:p>
+      <w:r>
+        <w:t>checkpoint gets used.</w:t>
+      </w:r>
+    </w:p>
+    <w:p>
+      <w:pPr>
+        <w:pStyle w:val="Heading1"/>
+      </w:pPr>
+      <w:r>
+        <w:rPr>
+          <w:color w:val="184F95"/>
+        </w:rPr>
+        <w:t>2.6 Complete repository structure and how data flows through it</w:t>
+      </w:r>
+    </w:p>
+    <w:p>
+      <w:pPr>
+        <w:spacing w:after="0"/>
+        <w:shd w:val="clear" w:color="auto" w:fill="F2F3F7"/>
+      </w:pPr>
+      <w:r>
+        <w:rPr>
+          <w:rFonts w:ascii="Consolas" w:hAnsi="Consolas"/>
+          <w:sz w:val="18"/>
+        </w:rPr>
+        <w:t>AreaSeminar/</w:t>
+      </w:r>
+    </w:p>
+    <w:p>
+      <w:pPr>
+        <w:spacing w:after="0"/>
+        <w:shd w:val="clear" w:color="auto" w:fill="F2F3F7"/>
+      </w:pPr>
+      <w:r>
+        <w:rPr>
+          <w:rFonts w:ascii="Consolas" w:hAnsi="Consolas"/>
+          <w:sz w:val="18"/>
+        </w:rPr>
+        <w:t>├── data/</w:t>
+      </w:r>
+    </w:p>
+    <w:p>
+      <w:pPr>
+        <w:spacing w:after="0"/>
+        <w:shd w:val="clear" w:color="auto" w:fill="F2F3F7"/>
+      </w:pPr>
+      <w:r>
+        <w:rPr>
+          <w:rFonts w:ascii="Consolas" w:hAnsi="Consolas"/>
+          <w:sz w:val="18"/>
+        </w:rPr>
+        <w:t>│   ├── raw/autofish/               # downloaded from Hugging Face (images + annotations.json)</w:t>
+      </w:r>
+    </w:p>
+    <w:p>
+      <w:pPr>
+        <w:spacing w:after="0"/>
+        <w:shd w:val="clear" w:color="auto" w:fill="F2F3F7"/>
+      </w:pPr>
+      <w:r>
+        <w:rPr>
+          <w:rFonts w:ascii="Consolas" w:hAnsi="Consolas"/>
+          <w:sz w:val="18"/>
+        </w:rPr>
+        <w:t>│   └── processed/</w:t>
+      </w:r>
+    </w:p>
+    <w:p>
+      <w:pPr>
+        <w:spacing w:after="0"/>
+        <w:shd w:val="clear" w:color="auto" w:fill="F2F3F7"/>
+      </w:pPr>
+      <w:r>
+        <w:rPr>
+          <w:rFonts w:ascii="Consolas" w:hAnsi="Consolas"/>
+          <w:sz w:val="18"/>
+        </w:rPr>
+        <w:t>│       ├── index.csv               # one row per annotation: bbox, length, species, split, group</w:t>
+      </w:r>
+    </w:p>
+    <w:p>
+      <w:pPr>
+        <w:spacing w:after="0"/>
+        <w:shd w:val="clear" w:color="auto" w:fill="F2F3F7"/>
+      </w:pPr>
+      <w:r>
+        <w:rPr>
+          <w:rFonts w:ascii="Consolas" w:hAnsi="Consolas"/>
+          <w:sz w:val="18"/>
+        </w:rPr>
+        <w:t>│       ├── splits.json             # the official train/val/test group lists</w:t>
+      </w:r>
+    </w:p>
+    <w:p>
+      <w:pPr>
+        <w:spacing w:after="0"/>
+        <w:shd w:val="clear" w:color="auto" w:fill="F2F3F7"/>
+      </w:pPr>
+      <w:r>
+        <w:rPr>
+          <w:rFonts w:ascii="Consolas" w:hAnsi="Consolas"/>
+          <w:sz w:val="18"/>
+        </w:rPr>
+        <w:t>│       ├── exclusions.json         # the fish-113 leakage fix, logged</w:t>
+      </w:r>
+    </w:p>
+    <w:p>
+      <w:pPr>
+        <w:spacing w:after="0"/>
+        <w:shd w:val="clear" w:color="auto" w:fill="F2F3F7"/>
+      </w:pPr>
+      <w:r>
+        <w:rPr>
+          <w:rFonts w:ascii="Consolas" w:hAnsi="Consolas"/>
+          <w:sz w:val="18"/>
+        </w:rPr>
+        <w:t>│       └── crops/*.png             # masked, square, 224x224 crops (output of §2.1)</w:t>
+      </w:r>
+    </w:p>
+    <w:p>
+      <w:pPr>
+        <w:spacing w:after="0"/>
+        <w:shd w:val="clear" w:color="auto" w:fill="F2F3F7"/>
+      </w:pPr>
+      <w:r>
+        <w:rPr>
+          <w:rFonts w:ascii="Consolas" w:hAnsi="Consolas"/>
+          <w:sz w:val="18"/>
+        </w:rPr>
+        <w:t>├── src/autofish_vfm/</w:t>
+      </w:r>
+    </w:p>
+    <w:p>
+      <w:pPr>
+        <w:spacing w:after="0"/>
+        <w:shd w:val="clear" w:color="auto" w:fill="F2F3F7"/>
+      </w:pPr>
+      <w:r>
+        <w:rPr>
+          <w:rFonts w:ascii="Consolas" w:hAnsi="Consolas"/>
+          <w:sz w:val="18"/>
+        </w:rPr>
+        <w:t>│   ├── data.py                     # CropDataset: loads a crop + bbox + target (§2.2)</w:t>
+      </w:r>
+    </w:p>
+    <w:p>
+      <w:pPr>
+        <w:spacing w:after="0"/>
+        <w:shd w:val="clear" w:color="auto" w:fill="F2F3F7"/>
+      </w:pPr>
+      <w:r>
+        <w:rPr>
+          <w:rFonts w:ascii="Consolas" w:hAnsi="Consolas"/>
+          <w:sz w:val="18"/>
+        </w:rPr>
+        <w:t>│   ├── models.py                   # MobileNetV2/EfficientNet/ConvNeXt/CLIP/DINOv2 + regression head (§2.3, §2.4)</w:t>
+      </w:r>
+    </w:p>
+    <w:p>
+      <w:pPr>
+        <w:spacing w:after="0"/>
+        <w:shd w:val="clear" w:color="auto" w:fill="F2F3F7"/>
+      </w:pPr>
+      <w:r>
+        <w:rPr>
+          <w:rFonts w:ascii="Consolas" w:hAnsi="Consolas"/>
+          <w:sz w:val="18"/>
+        </w:rPr>
+        <w:t>│   ├── train_baseline.py           # length-regression training loop (§2.5)</w:t>
+      </w:r>
+    </w:p>
+    <w:p>
+      <w:pPr>
+        <w:spacing w:after="0"/>
+        <w:shd w:val="clear" w:color="auto" w:fill="F2F3F7"/>
+      </w:pPr>
+      <w:r>
+        <w:rPr>
+          <w:rFonts w:ascii="Consolas" w:hAnsi="Consolas"/>
+          <w:sz w:val="18"/>
+        </w:rPr>
+        <w:t>│   ├── evaluate.py                 # runs a trained checkpoint once on val or test, saves metrics+predictions</w:t>
+      </w:r>
+    </w:p>
+    <w:p>
+      <w:pPr>
+        <w:spacing w:after="0"/>
+        <w:shd w:val="clear" w:color="auto" w:fill="F2F3F7"/>
+      </w:pPr>
+      <w:r>
+        <w:rPr>
+          <w:rFonts w:ascii="Consolas" w:hAnsi="Consolas"/>
+          <w:sz w:val="18"/>
+        </w:rPr>
+        <w:t>│   ├── train_classifier.py         # species-classification training loop (same pattern, cross-entropy)</w:t>
+      </w:r>
+    </w:p>
+    <w:p>
+      <w:pPr>
+        <w:spacing w:after="0"/>
+        <w:shd w:val="clear" w:color="auto" w:fill="F2F3F7"/>
+      </w:pPr>
+      <w:r>
+        <w:rPr>
+          <w:rFonts w:ascii="Consolas" w:hAnsi="Consolas"/>
+          <w:sz w:val="18"/>
+        </w:rPr>
+        <w:t>│   ├── evaluate_classifier.py      # classification evaluation</w:t>
+      </w:r>
+    </w:p>
+    <w:p>
+      <w:pPr>
+        <w:spacing w:after="0"/>
+        <w:shd w:val="clear" w:color="auto" w:fill="F2F3F7"/>
+      </w:pPr>
+      <w:r>
+        <w:rPr>
+          <w:rFonts w:ascii="Consolas" w:hAnsi="Consolas"/>
+          <w:sz w:val="18"/>
+        </w:rPr>
+        <w:t>│   └── metrics.py                  # MAE/RMSE/MAPE/bias/R2 and accuracy/macro-F1 implementations</w:t>
+      </w:r>
+    </w:p>
+    <w:p>
+      <w:pPr>
+        <w:spacing w:after="0"/>
+        <w:shd w:val="clear" w:color="auto" w:fill="F2F3F7"/>
+      </w:pPr>
+      <w:r>
+        <w:rPr>
+          <w:rFonts w:ascii="Consolas" w:hAnsi="Consolas"/>
+          <w:sz w:val="18"/>
+        </w:rPr>
+        <w:t>├── configs/*.json                  # one file per experiment: every hyperparameter, versioned</w:t>
+      </w:r>
+    </w:p>
+    <w:p>
+      <w:pPr>
+        <w:spacing w:after="0"/>
+        <w:shd w:val="clear" w:color="auto" w:fill="F2F3F7"/>
+      </w:pPr>
+      <w:r>
+        <w:rPr>
+          <w:rFonts w:ascii="Consolas" w:hAnsi="Consolas"/>
+          <w:sz w:val="18"/>
+        </w:rPr>
+        <w:t>├── scripts/</w:t>
+      </w:r>
+    </w:p>
+    <w:p>
+      <w:pPr>
+        <w:spacing w:after="0"/>
+        <w:shd w:val="clear" w:color="auto" w:fill="F2F3F7"/>
+      </w:pPr>
+      <w:r>
+        <w:rPr>
+          <w:rFonts w:ascii="Consolas" w:hAnsi="Consolas"/>
+          <w:sz w:val="18"/>
+        </w:rPr>
+        <w:t>│   ├── build_autofish_index.py     # raw annotations.json -&gt; index.csv (+ leakage audit)</w:t>
+      </w:r>
+    </w:p>
+    <w:p>
+      <w:pPr>
+        <w:spacing w:after="0"/>
+        <w:shd w:val="clear" w:color="auto" w:fill="F2F3F7"/>
+      </w:pPr>
+      <w:r>
+        <w:rPr>
+          <w:rFonts w:ascii="Consolas" w:hAnsi="Consolas"/>
+          <w:sz w:val="18"/>
+        </w:rPr>
+        <w:t>│   ├── make_crops.py               # index.csv -&gt; crops/*.png (§2.1)</w:t>
+      </w:r>
+    </w:p>
+    <w:p>
+      <w:pPr>
+        <w:spacing w:after="0"/>
+        <w:shd w:val="clear" w:color="auto" w:fill="F2F3F7"/>
+      </w:pPr>
+      <w:r>
+        <w:rPr>
+          <w:rFonts w:ascii="Consolas" w:hAnsi="Consolas"/>
+          <w:sz w:val="18"/>
+        </w:rPr>
+        <w:t>│   ├── run_*.sh                    # persistent training queues (train -&gt; evaluate per experiment)</w:t>
+      </w:r>
+    </w:p>
+    <w:p>
+      <w:pPr>
+        <w:spacing w:after="0"/>
+        <w:shd w:val="clear" w:color="auto" w:fill="F2F3F7"/>
+      </w:pPr>
+      <w:r>
+        <w:rPr>
+          <w:rFonts w:ascii="Consolas" w:hAnsi="Consolas"/>
+          <w:sz w:val="18"/>
+        </w:rPr>
+        <w:t>│   ├── error_analysis.py           # reads saved predictions -&gt; by-species/occlusion/length CSVs</w:t>
+      </w:r>
+    </w:p>
+    <w:p>
+      <w:pPr>
+        <w:spacing w:after="0"/>
+        <w:shd w:val="clear" w:color="auto" w:fill="F2F3F7"/>
+      </w:pPr>
+      <w:r>
+        <w:rPr>
+          <w:rFonts w:ascii="Consolas" w:hAnsi="Consolas"/>
+          <w:sz w:val="18"/>
+        </w:rPr>
+        <w:t>│   ├── make_qualitative_figures.py # reads saved predictions + crops -&gt; example comparison PNGs</w:t>
+      </w:r>
+    </w:p>
+    <w:p>
+      <w:pPr>
+        <w:spacing w:after="0"/>
+        <w:shd w:val="clear" w:color="auto" w:fill="F2F3F7"/>
+      </w:pPr>
+      <w:r>
+        <w:rPr>
+          <w:rFonts w:ascii="Consolas" w:hAnsi="Consolas"/>
+          <w:sz w:val="18"/>
+        </w:rPr>
+        <w:t>│   └── make_result_charts.py       # reads saved metrics -&gt; the poster/report bar charts</w:t>
+      </w:r>
+    </w:p>
+    <w:p>
+      <w:pPr>
+        <w:spacing w:after="0"/>
+        <w:shd w:val="clear" w:color="auto" w:fill="F2F3F7"/>
+      </w:pPr>
+      <w:r>
+        <w:rPr>
+          <w:rFonts w:ascii="Consolas" w:hAnsi="Consolas"/>
+          <w:sz w:val="18"/>
+        </w:rPr>
+        <w:t>├── runs/&lt;experiment_name&gt;/         # OUTPUT of one experiment: config.json, history.csv,</w:t>
+      </w:r>
+    </w:p>
+    <w:p>
+      <w:pPr>
+        <w:spacing w:after="0"/>
+        <w:shd w:val="clear" w:color="auto" w:fill="F2F3F7"/>
+      </w:pPr>
+      <w:r>
+        <w:rPr>
+          <w:rFonts w:ascii="Consolas" w:hAnsi="Consolas"/>
+          <w:sz w:val="18"/>
+        </w:rPr>
+        <w:t>│                                    # test_metrics.json, test_metrics.predictions.csv, best.pt</w:t>
+      </w:r>
+    </w:p>
+    <w:p>
+      <w:pPr>
+        <w:spacing w:after="0"/>
+        <w:shd w:val="clear" w:color="auto" w:fill="F2F3F7"/>
+      </w:pPr>
+      <w:r>
+        <w:rPr>
+          <w:rFonts w:ascii="Consolas" w:hAnsi="Consolas"/>
+          <w:sz w:val="18"/>
+        </w:rPr>
+        <w:t>├── results/</w:t>
+      </w:r>
+    </w:p>
+    <w:p>
+      <w:pPr>
+        <w:spacing w:after="0"/>
+        <w:shd w:val="clear" w:color="auto" w:fill="F2F3F7"/>
+      </w:pPr>
+      <w:r>
+        <w:rPr>
+          <w:rFonts w:ascii="Consolas" w:hAnsi="Consolas"/>
+          <w:sz w:val="18"/>
+        </w:rPr>
+        <w:t>│   ├── error_analysis/             # OUTPUT of error_analysis.py</w:t>
+      </w:r>
+    </w:p>
+    <w:p>
+      <w:pPr>
+        <w:spacing w:after="0"/>
+        <w:shd w:val="clear" w:color="auto" w:fill="F2F3F7"/>
+      </w:pPr>
+      <w:r>
+        <w:rPr>
+          <w:rFonts w:ascii="Consolas" w:hAnsi="Consolas"/>
+          <w:sz w:val="18"/>
+        </w:rPr>
+        <w:t>│   ├── qualitative/                # OUTPUT of make_qualitative_figures.py</w:t>
+      </w:r>
+    </w:p>
+    <w:p>
+      <w:pPr>
+        <w:spacing w:after="0"/>
+        <w:shd w:val="clear" w:color="auto" w:fill="F2F3F7"/>
+      </w:pPr>
+      <w:r>
+        <w:rPr>
+          <w:rFonts w:ascii="Consolas" w:hAnsi="Consolas"/>
+          <w:sz w:val="18"/>
+        </w:rPr>
+        <w:t>│   └── figures/                    # OUTPUT of make_result_charts.py</w:t>
+      </w:r>
+    </w:p>
+    <w:p>
+      <w:pPr>
+        <w:spacing w:after="0"/>
+        <w:shd w:val="clear" w:color="auto" w:fill="F2F3F7"/>
+      </w:pPr>
+      <w:r>
+        <w:rPr>
+          <w:rFonts w:ascii="Consolas" w:hAnsi="Consolas"/>
+          <w:sz w:val="18"/>
+        </w:rPr>
+        <w:t>├── poster/                         # A3 poster HTML + PDF</w:t>
+      </w:r>
+    </w:p>
+    <w:p>
+      <w:pPr>
+        <w:spacing w:after="0"/>
+        <w:shd w:val="clear" w:color="auto" w:fill="F2F3F7"/>
+      </w:pPr>
+      <w:r>
+        <w:rPr>
+          <w:rFonts w:ascii="Consolas" w:hAnsi="Consolas"/>
+          <w:sz w:val="18"/>
+        </w:rPr>
+        <w:t>└── docs/                           # this guide, the ODE report, the audit, the explainer, etc.</w:t>
+      </w:r>
+    </w:p>
+    <w:p>
+      <w:r/>
+      <w:r>
+        <w:rPr>
+          <w:b/>
+        </w:rPr>
+        <w:t>The exact sequence, start to finish, for one experiment:</w:t>
+      </w:r>
+      <w:r/>
+    </w:p>
+    <w:p>
+      <w:pPr>
+        <w:pStyle w:val="ListNumber"/>
+      </w:pPr>
+      <w:r>
+        <w:t>`scripts/build_autofish_index.py` turns the raw Hugging Face download into `index.csv`, running</w:t>
+      </w:r>
+    </w:p>
+    <w:p>
+      <w:r>
+        <w:t>the leakage audit and writing `splits.json` / `exclusions.json`.</w:t>
+      </w:r>
+    </w:p>
+    <w:p>
+      <w:pPr>
+        <w:pStyle w:val="ListNumber"/>
+      </w:pPr>
+      <w:r>
+        <w:t>`scripts/make_crops.py` reads `index.csv` and produces every masked crop PNG (§2.1) — done once,</w:t>
+      </w:r>
+    </w:p>
+    <w:p>
+      <w:r>
+        <w:t>shared by every experiment.</w:t>
+      </w:r>
+    </w:p>
+    <w:p>
+      <w:pPr>
+        <w:pStyle w:val="ListNumber"/>
+      </w:pPr>
+      <w:r>
+        <w:t>A `configs/&lt;name&gt;.json` file is written or copied, fixing every hyperparameter for one experiment.</w:t>
+      </w:r>
+    </w:p>
+    <w:p>
+      <w:pPr>
+        <w:pStyle w:val="ListNumber"/>
+      </w:pPr>
+      <w:r>
+        <w:t>`src/autofish_vfm/train_baseline.py --config configs/&lt;name&gt;.json` trains the model (§2.5), reading</w:t>
+      </w:r>
+    </w:p>
+    <w:p>
+      <w:r>
+        <w:t>crops via `CropDataset` (§2.2) and the chosen encoder from `models.py` (§2.3/§2.4), writing</w:t>
+      </w:r>
+    </w:p>
+    <w:p>
+      <w:r>
+        <w:t>`runs/&lt;name&gt;/{config.json,history.csv,best.pt,last.pt}`.</w:t>
+      </w:r>
+    </w:p>
+    <w:p>
+      <w:pPr>
+        <w:pStyle w:val="ListNumber"/>
+      </w:pPr>
+      <w:r>
+        <w:t>`src/autofish_vfm/evaluate.py --checkpoint runs/&lt;name&gt;/best.pt` runs the frozen best checkpoint</w:t>
+      </w:r>
+    </w:p>
+    <w:p>
+      <w:r>
+        <w:t>once on the test split, writing `runs/&lt;name&gt;/test_metrics.json` and the per-fish predictions CSV.</w:t>
+      </w:r>
+    </w:p>
+    <w:p>
+      <w:pPr>
+        <w:pStyle w:val="ListNumber"/>
+      </w:pPr>
+      <w:r>
+        <w:t>`scripts/error_analysis.py`, `make_qualitative_figures.py`, and `make_result_charts.py` read</w:t>
+      </w:r>
+    </w:p>
+    <w:p>
+      <w:r>
+        <w:t>*only* those saved `runs/*/test_metrics*` files — no retraining — to build every table, figure, and</w:t>
+      </w:r>
+    </w:p>
+    <w:p>
+      <w:r>
+        <w:t>chart used in the poster and reports.</w:t>
+      </w:r>
+    </w:p>
+    <w:p>
+      <w:r>
+        <w:t>This sequence is why the "no-repeat" rule was possible to follow: every downstream document in this</w:t>
+      </w:r>
+    </w:p>
+    <w:p>
+      <w:r>
+        <w:t>project (poster, ODE, this guide, the HTML explainer) is generated from files already sitting in</w:t>
+      </w:r>
+    </w:p>
+    <w:p>
+      <w:r>
+        <w:t>`runs/` and `results/`, never by re-running training.</w:t>
+      </w:r>
+    </w:p>
+    <w:p>
+      <w:pPr>
+        <w:pStyle w:val="Heading1"/>
+      </w:pPr>
+      <w:r>
+        <w:rPr>
+          <w:color w:val="184F95"/>
+        </w:rPr>
         <w:t>Professor Defense Q&amp;A</w:t>
       </w:r>
     </w:p>

</xml_diff>